<commit_message>
Actualizar documentos de referencia y términos legales
- Calculos-tasas-dinero-comisiones/ y SOBRE PLANES Y PAGOS/: documentos de
  referencia de negocio (nuevos)
- Actualiza estudio de mercado, notas de trabajo y términos legales
  (docx + PDF servido en app/public/legal)

Co-Authored-By: Claude Sonnet 5 <noreply@anthropic.com>
</commit_message>
<xml_diff>
--- a/ESTUDIO DE MERCADO Y ESTRATEGIA DE PRECIOS REMESAS PE-VE 07-2026.docx
+++ b/ESTUDIO DE MERCADO Y ESTRATEGIA DE PRECIOS REMESAS PE-VE 07-2026.docx
@@ -1,6 +1,6 @@
 
 <file path=word/document.xml><?xml version="1.0" encoding="utf-8"?>
-<w:document xmlns:wpc="http://schemas.microsoft.com/office/word/2010/wordprocessingCanvas" xmlns:cx="http://schemas.microsoft.com/office/drawing/2014/chartex" xmlns:cx1="http://schemas.microsoft.com/office/drawing/2015/9/8/chartex" xmlns:cx2="http://schemas.microsoft.com/office/drawing/2015/10/21/chartex" xmlns:cx3="http://schemas.microsoft.com/office/drawing/2016/5/9/chartex" xmlns:cx4="http://schemas.microsoft.com/office/drawing/2016/5/10/chartex" xmlns:cx5="http://schemas.microsoft.com/office/drawing/2016/5/11/chartex" xmlns:cx6="http://schemas.microsoft.com/office/drawing/2016/5/12/chartex" xmlns:cx7="http://schemas.microsoft.com/office/drawing/2016/5/13/chartex" xmlns:cx8="http://schemas.microsoft.com/office/drawing/2016/5/14/chartex" xmlns:mc="http://schemas.openxmlformats.org/markup-compatibility/2006" xmlns:aink="http://schemas.microsoft.com/office/drawing/2016/ink" xmlns:am3d="http://schemas.microsoft.com/office/drawing/2017/model3d" xmlns:o="urn:schemas-microsoft-com:office:office" xmlns:oel="http://schemas.microsoft.com/office/2019/extlst" xmlns:r="http://schemas.openxmlformats.org/officeDocument/2006/relationships" xmlns:m="http://schemas.openxmlformats.org/officeDocument/2006/math" xmlns:v="urn:schemas-microsoft-com:vml" xmlns:wp14="http://schemas.microsoft.com/office/word/2010/wordprocessingDrawing" xmlns:wp="http://schemas.openxmlformats.org/drawingml/2006/wordprocessingDrawing" xmlns:w10="urn:schemas-microsoft-com:office:word" xmlns:w="http://schemas.openxmlformats.org/wordprocessingml/2006/main" xmlns:w14="http://schemas.microsoft.com/office/word/2010/wordml" xmlns:w15="http://schemas.microsoft.com/office/word/2012/wordml" xmlns:w16cex="http://schemas.microsoft.com/office/word/2018/wordml/cex" xmlns:w16cid="http://schemas.microsoft.com/office/word/2016/wordml/cid" xmlns:w16="http://schemas.microsoft.com/office/word/2018/wordml" xmlns:w16du="http://schemas.microsoft.com/office/word/2023/wordml/word16du" xmlns:w16sdtdh="http://schemas.microsoft.com/office/word/2020/wordml/sdtdatahash" xmlns:w16sdtfl="http://schemas.microsoft.com/office/word/2024/wordml/sdtformatlock" xmlns:w16se="http://schemas.microsoft.com/office/word/2015/wordml/symex" xmlns:wpg="http://schemas.microsoft.com/office/word/2010/wordprocessingGroup" xmlns:wpi="http://schemas.microsoft.com/office/word/2010/wordprocessingInk" xmlns:wne="http://schemas.microsoft.com/office/word/2006/wordml" xmlns:wps="http://schemas.microsoft.com/office/word/2010/wordprocessingShape" mc:Ignorable="w14 w15 w16se w16cid w16 w16cex w16sdtdh w16sdtfl w16du wp14">
+<w:document xmlns:wpc="http://schemas.microsoft.com/office/word/2010/wordprocessingCanvas" xmlns:cx="http://schemas.microsoft.com/office/drawing/2014/chartex" xmlns:cx1="http://schemas.microsoft.com/office/drawing/2015/9/8/chartex" xmlns:cx2="http://schemas.microsoft.com/office/drawing/2015/10/21/chartex" xmlns:cx3="http://schemas.microsoft.com/office/drawing/2016/5/9/chartex" xmlns:cx4="http://schemas.microsoft.com/office/drawing/2016/5/10/chartex" xmlns:cx5="http://schemas.microsoft.com/office/drawing/2016/5/11/chartex" xmlns:cx6="http://schemas.microsoft.com/office/drawing/2016/5/12/chartex" xmlns:cx7="http://schemas.microsoft.com/office/drawing/2016/5/13/chartex" xmlns:cx8="http://schemas.microsoft.com/office/drawing/2016/5/14/chartex" xmlns:mc="http://schemas.openxmlformats.org/markup-compatibility/2006" xmlns:aink="http://schemas.microsoft.com/office/drawing/2016/ink" xmlns:am3d="http://schemas.microsoft.com/office/drawing/2017/model3d" xmlns:o="urn:schemas-microsoft-com:office:office" xmlns:oel="http://schemas.microsoft.com/office/2019/extlst" xmlns:r="http://schemas.openxmlformats.org/officeDocument/2006/relationships" xmlns:m="http://schemas.openxmlformats.org/officeDocument/2006/math" xmlns:v="urn:schemas-microsoft-com:vml" xmlns:wp14="http://schemas.microsoft.com/office/word/2010/wordprocessingDrawing" xmlns:wp="http://schemas.openxmlformats.org/drawingml/2006/wordprocessingDrawing" xmlns:w10="urn:schemas-microsoft-com:office:word" xmlns:w="http://schemas.openxmlformats.org/wordprocessingml/2006/main" xmlns:w14="http://schemas.microsoft.com/office/word/2010/wordml" xmlns:w15="http://schemas.microsoft.com/office/word/2012/wordml" xmlns:w16cei="http://schemas.microsoft.com/office/word/2026/wordml/cei" xmlns:w16cex="http://schemas.microsoft.com/office/word/2018/wordml/cex" xmlns:w16cid="http://schemas.microsoft.com/office/word/2016/wordml/cid" xmlns:w16="http://schemas.microsoft.com/office/word/2018/wordml" xmlns:w16du="http://schemas.microsoft.com/office/word/2023/wordml/word16du" xmlns:w16sdtdh="http://schemas.microsoft.com/office/word/2020/wordml/sdtdatahash" xmlns:w16sdtfl="http://schemas.microsoft.com/office/word/2024/wordml/sdtformatlock" xmlns:w16se="http://schemas.microsoft.com/office/word/2015/wordml/symex" xmlns:wpg="http://schemas.microsoft.com/office/word/2010/wordprocessingGroup" xmlns:wpi="http://schemas.microsoft.com/office/word/2010/wordprocessingInk" xmlns:wne="http://schemas.microsoft.com/office/word/2006/wordml" xmlns:wps="http://schemas.microsoft.com/office/word/2010/wordprocessingShape" mc:Ignorable="w14 w15 w16se w16cid w16 w16cex w16sdtdh w16sdtfl w16du wp14">
   <w:body>
     <w:p>
       <w:pPr>
@@ -56,7 +56,7 @@
       </w:pPr>
       <w:r>
         <w:pict w14:anchorId="0586C9F3">
-          <v:rect id="_x0000_i1340" style="width:0;height:.75pt" o:hralign="center" o:hrstd="t" o:hr="t" fillcolor="#a0a0a0" stroked="f"/>
+          <v:rect id="_x0000_i1025" style="width:0;height:.75pt" o:hralign="center" o:hrstd="t" o:hr="t" fillcolor="#a0a0a0" stroked="f"/>
         </w:pict>
       </w:r>
     </w:p>
@@ -2816,7 +2816,7 @@
       </w:pPr>
       <w:r>
         <w:pict w14:anchorId="1EFE2FF1">
-          <v:rect id="_x0000_i1341" style="width:0;height:.75pt" o:hralign="center" o:hrstd="t" o:hr="t" fillcolor="#a0a0a0" stroked="f"/>
+          <v:rect id="_x0000_i1026" style="width:0;height:.75pt" o:hralign="center" o:hrstd="t" o:hr="t" fillcolor="#a0a0a0" stroked="f"/>
         </w:pict>
       </w:r>
     </w:p>
@@ -6336,13 +6336,7 @@
               <w:ind w:right="-376"/>
             </w:pPr>
             <w:r>
-              <w:t xml:space="preserve">Hasta S/ </w:t>
-            </w:r>
-            <w:r>
-              <w:t>5</w:t>
-            </w:r>
-            <w:r>
-              <w:t>00 a +</w:t>
+              <w:t>Hasta S/ 500 a +</w:t>
             </w:r>
           </w:p>
         </w:tc>
@@ -6904,7 +6898,13 @@
               <w:ind w:right="-376"/>
             </w:pPr>
             <w:r>
-              <w:t>S/ 500.00</w:t>
+              <w:t xml:space="preserve">S/ </w:t>
+            </w:r>
+            <w:r>
+              <w:t>6</w:t>
+            </w:r>
+            <w:r>
+              <w:t>00.00</w:t>
             </w:r>
           </w:p>
         </w:tc>
@@ -7628,7 +7628,7 @@
       </w:pPr>
       <w:r>
         <w:pict w14:anchorId="4E6E202A">
-          <v:rect id="_x0000_i1343" style="width:0;height:.75pt" o:hralign="center" o:hrstd="t" o:hr="t" fillcolor="#a0a0a0" stroked="f"/>
+          <v:rect id="_x0000_i1027" style="width:0;height:.75pt" o:hralign="center" o:hrstd="t" o:hr="t" fillcolor="#a0a0a0" stroked="f"/>
         </w:pict>
       </w:r>
     </w:p>
@@ -15373,7 +15373,7 @@
       </w:pPr>
       <w:r>
         <w:pict w14:anchorId="71D4D50E">
-          <v:rect id="_x0000_i1344" style="width:0;height:.75pt" o:hralign="center" o:hrstd="t" o:hr="t" fillcolor="#a0a0a0" stroked="f"/>
+          <v:rect id="_x0000_i1028" style="width:0;height:.75pt" o:hralign="center" o:hrstd="t" o:hr="t" fillcolor="#a0a0a0" stroked="f"/>
         </w:pict>
       </w:r>
     </w:p>
@@ -17807,7 +17807,7 @@
       </w:pPr>
       <w:r>
         <w:pict w14:anchorId="0CFE6636">
-          <v:rect id="_x0000_i1345" style="width:0;height:.75pt" o:hralign="center" o:hrstd="t" o:hr="t" fillcolor="#a0a0a0" stroked="f"/>
+          <v:rect id="_x0000_i1029" style="width:0;height:.75pt" o:hralign="center" o:hrstd="t" o:hr="t" fillcolor="#a0a0a0" stroked="f"/>
         </w:pict>
       </w:r>
     </w:p>
@@ -20328,7 +20328,7 @@
       </w:pPr>
       <w:r>
         <w:pict w14:anchorId="16A3DD4B">
-          <v:rect id="_x0000_i1346" style="width:0;height:.75pt" o:hralign="center" o:hrstd="t" o:hr="t" fillcolor="#a0a0a0" stroked="f"/>
+          <v:rect id="_x0000_i1030" style="width:0;height:.75pt" o:hralign="center" o:hrstd="t" o:hr="t" fillcolor="#a0a0a0" stroked="f"/>
         </w:pict>
       </w:r>
     </w:p>
@@ -20688,7 +20688,7 @@
       </w:pPr>
       <w:r>
         <w:pict w14:anchorId="276D3826">
-          <v:rect id="_x0000_i1347" style="width:0;height:.75pt" o:hralign="center" o:hrstd="t" o:hr="t" fillcolor="#a0a0a0" stroked="f"/>
+          <v:rect id="_x0000_i1031" style="width:0;height:.75pt" o:hralign="center" o:hrstd="t" o:hr="t" fillcolor="#a0a0a0" stroked="f"/>
         </w:pict>
       </w:r>
     </w:p>
@@ -21868,7 +21868,7 @@
       </w:pPr>
       <w:r>
         <w:pict w14:anchorId="240FE299">
-          <v:rect id="_x0000_i1348" style="width:0;height:.75pt" o:hralign="center" o:hrstd="t" o:hr="t" fillcolor="#a0a0a0" stroked="f"/>
+          <v:rect id="_x0000_i1032" style="width:0;height:.75pt" o:hralign="center" o:hrstd="t" o:hr="t" fillcolor="#a0a0a0" stroked="f"/>
         </w:pict>
       </w:r>
     </w:p>
@@ -26641,7 +26641,7 @@
 </file>
 
 <file path=word/numbering.xml><?xml version="1.0" encoding="utf-8"?>
-<w:numbering xmlns:wpc="http://schemas.microsoft.com/office/word/2010/wordprocessingCanvas" xmlns:cx="http://schemas.microsoft.com/office/drawing/2014/chartex" xmlns:cx1="http://schemas.microsoft.com/office/drawing/2015/9/8/chartex" xmlns:cx2="http://schemas.microsoft.com/office/drawing/2015/10/21/chartex" xmlns:cx3="http://schemas.microsoft.com/office/drawing/2016/5/9/chartex" xmlns:cx4="http://schemas.microsoft.com/office/drawing/2016/5/10/chartex" xmlns:cx5="http://schemas.microsoft.com/office/drawing/2016/5/11/chartex" xmlns:cx6="http://schemas.microsoft.com/office/drawing/2016/5/12/chartex" xmlns:cx7="http://schemas.microsoft.com/office/drawing/2016/5/13/chartex" xmlns:cx8="http://schemas.microsoft.com/office/drawing/2016/5/14/chartex" xmlns:mc="http://schemas.openxmlformats.org/markup-compatibility/2006" xmlns:aink="http://schemas.microsoft.com/office/drawing/2016/ink" xmlns:am3d="http://schemas.microsoft.com/office/drawing/2017/model3d" xmlns:o="urn:schemas-microsoft-com:office:office" xmlns:oel="http://schemas.microsoft.com/office/2019/extlst" xmlns:r="http://schemas.openxmlformats.org/officeDocument/2006/relationships" xmlns:m="http://schemas.openxmlformats.org/officeDocument/2006/math" xmlns:v="urn:schemas-microsoft-com:vml" xmlns:wp14="http://schemas.microsoft.com/office/word/2010/wordprocessingDrawing" xmlns:wp="http://schemas.openxmlformats.org/drawingml/2006/wordprocessingDrawing" xmlns:w10="urn:schemas-microsoft-com:office:word" xmlns:w="http://schemas.openxmlformats.org/wordprocessingml/2006/main" xmlns:w14="http://schemas.microsoft.com/office/word/2010/wordml" xmlns:w15="http://schemas.microsoft.com/office/word/2012/wordml" xmlns:w16cex="http://schemas.microsoft.com/office/word/2018/wordml/cex" xmlns:w16cid="http://schemas.microsoft.com/office/word/2016/wordml/cid" xmlns:w16="http://schemas.microsoft.com/office/word/2018/wordml" xmlns:w16du="http://schemas.microsoft.com/office/word/2023/wordml/word16du" xmlns:w16sdtdh="http://schemas.microsoft.com/office/word/2020/wordml/sdtdatahash" xmlns:w16sdtfl="http://schemas.microsoft.com/office/word/2024/wordml/sdtformatlock" xmlns:w16se="http://schemas.microsoft.com/office/word/2015/wordml/symex" xmlns:wpg="http://schemas.microsoft.com/office/word/2010/wordprocessingGroup" xmlns:wpi="http://schemas.microsoft.com/office/word/2010/wordprocessingInk" xmlns:wne="http://schemas.microsoft.com/office/word/2006/wordml" xmlns:wps="http://schemas.microsoft.com/office/word/2010/wordprocessingShape" mc:Ignorable="w14 w15 w16se w16cid w16 w16cex w16sdtdh w16sdtfl w16du wp14">
+<w:numbering xmlns:wpc="http://schemas.microsoft.com/office/word/2010/wordprocessingCanvas" xmlns:cx="http://schemas.microsoft.com/office/drawing/2014/chartex" xmlns:cx1="http://schemas.microsoft.com/office/drawing/2015/9/8/chartex" xmlns:cx2="http://schemas.microsoft.com/office/drawing/2015/10/21/chartex" xmlns:cx3="http://schemas.microsoft.com/office/drawing/2016/5/9/chartex" xmlns:cx4="http://schemas.microsoft.com/office/drawing/2016/5/10/chartex" xmlns:cx5="http://schemas.microsoft.com/office/drawing/2016/5/11/chartex" xmlns:cx6="http://schemas.microsoft.com/office/drawing/2016/5/12/chartex" xmlns:cx7="http://schemas.microsoft.com/office/drawing/2016/5/13/chartex" xmlns:cx8="http://schemas.microsoft.com/office/drawing/2016/5/14/chartex" xmlns:mc="http://schemas.openxmlformats.org/markup-compatibility/2006" xmlns:aink="http://schemas.microsoft.com/office/drawing/2016/ink" xmlns:am3d="http://schemas.microsoft.com/office/drawing/2017/model3d" xmlns:o="urn:schemas-microsoft-com:office:office" xmlns:oel="http://schemas.microsoft.com/office/2019/extlst" xmlns:r="http://schemas.openxmlformats.org/officeDocument/2006/relationships" xmlns:m="http://schemas.openxmlformats.org/officeDocument/2006/math" xmlns:v="urn:schemas-microsoft-com:vml" xmlns:wp14="http://schemas.microsoft.com/office/word/2010/wordprocessingDrawing" xmlns:wp="http://schemas.openxmlformats.org/drawingml/2006/wordprocessingDrawing" xmlns:w10="urn:schemas-microsoft-com:office:word" xmlns:w="http://schemas.openxmlformats.org/wordprocessingml/2006/main" xmlns:w14="http://schemas.microsoft.com/office/word/2010/wordml" xmlns:w15="http://schemas.microsoft.com/office/word/2012/wordml" xmlns:w16cei="http://schemas.microsoft.com/office/word/2026/wordml/cei" xmlns:w16cex="http://schemas.microsoft.com/office/word/2018/wordml/cex" xmlns:w16cid="http://schemas.microsoft.com/office/word/2016/wordml/cid" xmlns:w16="http://schemas.microsoft.com/office/word/2018/wordml" xmlns:w16du="http://schemas.microsoft.com/office/word/2023/wordml/word16du" xmlns:w16sdtdh="http://schemas.microsoft.com/office/word/2020/wordml/sdtdatahash" xmlns:w16sdtfl="http://schemas.microsoft.com/office/word/2024/wordml/sdtformatlock" xmlns:w16se="http://schemas.microsoft.com/office/word/2015/wordml/symex" xmlns:wpg="http://schemas.microsoft.com/office/word/2010/wordprocessingGroup" xmlns:wpi="http://schemas.microsoft.com/office/word/2010/wordprocessingInk" xmlns:wne="http://schemas.microsoft.com/office/word/2006/wordml" xmlns:wps="http://schemas.microsoft.com/office/word/2010/wordprocessingShape" mc:Ignorable="w14 w15 w16se w16cid w16 w16cex w16sdtdh w16sdtfl w16du wp14">
   <w:abstractNum w:abstractNumId="0" w15:restartNumberingAfterBreak="0">
     <w:nsid w:val="028552E2"/>
     <w:multiLevelType w:val="multilevel"/>
@@ -28818,6 +28818,7 @@
   <w:style w:type="character" w:default="1" w:styleId="Fuentedeprrafopredeter">
     <w:name w:val="Default Paragraph Font"/>
     <w:uiPriority w:val="1"/>
+    <w:semiHidden/>
     <w:unhideWhenUsed/>
   </w:style>
   <w:style w:type="table" w:default="1" w:styleId="Tablanormal">

</xml_diff>